<commit_message>
Incluye enlace al repositorio en el documento
</commit_message>
<xml_diff>
--- a/entregables/Registro_del_cambio.docx
+++ b/entregables/Registro_del_cambio.docx
@@ -606,8 +606,22 @@
     </w:p>
     <w:p>
       <w:r>
-        <w:t>La entrega contiene el código, una interfaz de demostración, instrucciones de ejecución y pruebas reproducibles. La presentación ejecutiva explica el cambio con lenguaje no técnico. La publicación en GitHub queda pendiente de definir el repositorio de destino. Este registro reconstruye el antes y después del ejercicio; no representa un historial previo de desarrollo.</w:t>
+        <w:t>La entrega contiene el código, una interfaz de demostración, instrucciones de ejecución y pruebas reproducibles. La presentación ejecutiva explica el cambio con lenguaje no técnico. El proyecto está publicado en un repositorio público de GitHub. Este registro reconstruye el antes y después del ejercicio; no representa un historial previo de desarrollo.</w:t>
       </w:r>
+    </w:p>
+    <w:p>
+      <w:r>
+        <w:t xml:space="preserve">Repositorio del proyecto: </w:t>
+      </w:r>
+      <w:hyperlink r:id="rId9">
+        <w:r>
+          <w:rPr>
+            <w:color w:val="2456A6"/>
+            <w:u w:val="single"/>
+          </w:rPr>
+          <w:t>https://github.com/Geralldb-96/prototipo-de-turismo</w:t>
+        </w:r>
+      </w:hyperlink>
     </w:p>
     <w:p>
       <w:r>

</xml_diff>